<commit_message>
updated sprint 2 report
</commit_message>
<xml_diff>
--- a/srDesign_SprintReport2.docx
+++ b/srDesign_SprintReport2.docx
@@ -1351,112 +1351,171 @@
     </w:p>
     <w:p>
       <w:pPr>
-        <w:pStyle w:val="Heading1"/>
-      </w:pPr>
+        <w:pStyle w:val="Heading2"/>
+      </w:pPr>
+      <w:proofErr w:type="spellStart"/>
+      <w:proofErr w:type="gramStart"/>
       <w:r>
         <w:lastRenderedPageBreak/>
-        <w:t>Scrum Meetings</w:t>
-      </w:r>
-    </w:p>
-    <w:p>
-      <w:pPr>
-        <w:pStyle w:val="ListParagraph"/>
-        <w:numPr>
-          <w:ilvl w:val="0"/>
-          <w:numId w:val="3"/>
-        </w:numPr>
-      </w:pPr>
-      <w:r>
-        <w:t>refined communication of existing network so we can understand how to implement it on our components</w:t>
-      </w:r>
-    </w:p>
-    <w:p>
-      <w:pPr>
-        <w:pStyle w:val="ListParagraph"/>
-        <w:numPr>
-          <w:ilvl w:val="0"/>
-          <w:numId w:val="3"/>
-        </w:numPr>
-      </w:pPr>
-      <w:r>
-        <w:t>refined scope of each component</w:t>
-      </w:r>
-    </w:p>
-    <w:p>
-      <w:pPr>
-        <w:pStyle w:val="ListParagraph"/>
-        <w:numPr>
-          <w:ilvl w:val="0"/>
-          <w:numId w:val="3"/>
-        </w:numPr>
-      </w:pPr>
-      <w:r>
-        <w:t>updated product backlog to give our client a vision and sense of progress</w:t>
-      </w:r>
-    </w:p>
-    <w:p>
-      <w:pPr>
-        <w:pStyle w:val="Heading1"/>
-      </w:pPr>
-      <w:r>
-        <w:t>Research</w:t>
-      </w:r>
-    </w:p>
-    <w:p>
-      <w:pPr>
-        <w:pStyle w:val="ListParagraph"/>
-        <w:numPr>
-          <w:ilvl w:val="0"/>
-          <w:numId w:val="4"/>
-        </w:numPr>
-      </w:pPr>
+        <w:t>vSTB</w:t>
+      </w:r>
+      <w:proofErr w:type="spellEnd"/>
+      <w:proofErr w:type="gramEnd"/>
+      <w:r>
+        <w:t xml:space="preserve"> Features</w:t>
+      </w:r>
+    </w:p>
+    <w:p>
+      <w:pPr>
+        <w:pStyle w:val="ListParagraph"/>
+        <w:numPr>
+          <w:ilvl w:val="0"/>
+          <w:numId w:val="6"/>
+        </w:numPr>
+      </w:pPr>
+      <w:r>
+        <w:t xml:space="preserve">Communication Layer component allows the </w:t>
+      </w:r>
       <w:proofErr w:type="spellStart"/>
       <w:r>
-        <w:t>CommandLink</w:t>
+        <w:t>vSTB</w:t>
       </w:r>
       <w:proofErr w:type="spellEnd"/>
       <w:r>
-        <w:t xml:space="preserve"> Message</w:t>
-      </w:r>
-    </w:p>
-    <w:p>
-      <w:pPr>
-        <w:pStyle w:val="ListParagraph"/>
-        <w:numPr>
-          <w:ilvl w:val="0"/>
-          <w:numId w:val="4"/>
-        </w:numPr>
-      </w:pPr>
-      <w:r>
-        <w:t xml:space="preserve">Reactive Extension for Server and </w:t>
-      </w:r>
-      <w:proofErr w:type="spellStart"/>
-      <w:r>
-        <w:t>vAPMAX</w:t>
-      </w:r>
-      <w:proofErr w:type="spellEnd"/>
-    </w:p>
-    <w:p>
-      <w:pPr>
-        <w:pStyle w:val="ListParagraph"/>
-        <w:numPr>
-          <w:ilvl w:val="0"/>
-          <w:numId w:val="4"/>
-        </w:numPr>
-      </w:pPr>
-      <w:r>
-        <w:t>SI Stream</w:t>
-      </w:r>
-    </w:p>
-    <w:p>
-      <w:pPr>
-        <w:pStyle w:val="Heading1"/>
-      </w:pPr>
-      <w:r>
-        <w:t>Code Experiments</w:t>
+        <w:t xml:space="preserve"> to send and receive UDP and TCP messages that are defined in the Command Message protocol.</w:t>
+      </w:r>
+    </w:p>
+    <w:p>
+      <w:pPr>
+        <w:pStyle w:val="ListParagraph"/>
+        <w:numPr>
+          <w:ilvl w:val="0"/>
+          <w:numId w:val="6"/>
+        </w:numPr>
+      </w:pPr>
+      <w:r>
+        <w:t>Creates a modular and scalable framework to work with existing games on the STB</w:t>
+      </w:r>
+    </w:p>
+    <w:p>
+      <w:pPr>
+        <w:pStyle w:val="ListParagraph"/>
+        <w:numPr>
+          <w:ilvl w:val="0"/>
+          <w:numId w:val="6"/>
+        </w:numPr>
+      </w:pPr>
+      <w:r>
+        <w:t>Ultimately reduces the current load on the STB since resources are requested instead of stored locally</w:t>
       </w:r>
       <w:bookmarkStart w:id="0" w:name="_GoBack"/>
       <w:bookmarkEnd w:id="0"/>
+    </w:p>
+    <w:p>
+      <w:pPr>
+        <w:pStyle w:val="Heading1"/>
+      </w:pPr>
+      <w:r>
+        <w:t>Scrum Meetings</w:t>
+      </w:r>
+    </w:p>
+    <w:p>
+      <w:pPr>
+        <w:pStyle w:val="ListParagraph"/>
+        <w:numPr>
+          <w:ilvl w:val="0"/>
+          <w:numId w:val="3"/>
+        </w:numPr>
+      </w:pPr>
+      <w:r>
+        <w:t>refined communication of existing network so we can understand how to implement it on our components</w:t>
+      </w:r>
+    </w:p>
+    <w:p>
+      <w:pPr>
+        <w:pStyle w:val="ListParagraph"/>
+        <w:numPr>
+          <w:ilvl w:val="0"/>
+          <w:numId w:val="3"/>
+        </w:numPr>
+      </w:pPr>
+      <w:r>
+        <w:t>refined scope of each component</w:t>
+      </w:r>
+    </w:p>
+    <w:p>
+      <w:pPr>
+        <w:pStyle w:val="ListParagraph"/>
+        <w:numPr>
+          <w:ilvl w:val="0"/>
+          <w:numId w:val="3"/>
+        </w:numPr>
+      </w:pPr>
+      <w:r>
+        <w:t>updated product backlog to give our client a vision and sense of progress</w:t>
+      </w:r>
+    </w:p>
+    <w:p>
+      <w:pPr>
+        <w:pStyle w:val="Heading1"/>
+      </w:pPr>
+      <w:r>
+        <w:t>Research</w:t>
+      </w:r>
+    </w:p>
+    <w:p>
+      <w:pPr>
+        <w:pStyle w:val="ListParagraph"/>
+        <w:numPr>
+          <w:ilvl w:val="0"/>
+          <w:numId w:val="4"/>
+        </w:numPr>
+      </w:pPr>
+      <w:proofErr w:type="spellStart"/>
+      <w:r>
+        <w:t>CommandLink</w:t>
+      </w:r>
+      <w:proofErr w:type="spellEnd"/>
+      <w:r>
+        <w:t xml:space="preserve"> Message</w:t>
+      </w:r>
+    </w:p>
+    <w:p>
+      <w:pPr>
+        <w:pStyle w:val="ListParagraph"/>
+        <w:numPr>
+          <w:ilvl w:val="0"/>
+          <w:numId w:val="4"/>
+        </w:numPr>
+      </w:pPr>
+      <w:r>
+        <w:t xml:space="preserve">Reactive Extension for Server and </w:t>
+      </w:r>
+      <w:proofErr w:type="spellStart"/>
+      <w:r>
+        <w:t>vAPMAX</w:t>
+      </w:r>
+      <w:proofErr w:type="spellEnd"/>
+    </w:p>
+    <w:p>
+      <w:pPr>
+        <w:pStyle w:val="ListParagraph"/>
+        <w:numPr>
+          <w:ilvl w:val="0"/>
+          <w:numId w:val="4"/>
+        </w:numPr>
+      </w:pPr>
+      <w:r>
+        <w:t>SI Stream</w:t>
+      </w:r>
+    </w:p>
+    <w:p>
+      <w:pPr>
+        <w:pStyle w:val="Heading1"/>
+      </w:pPr>
+      <w:r>
+        <w:t>Code Experiments</w:t>
+      </w:r>
     </w:p>
     <w:p>
       <w:pPr>
@@ -1759,6 +1818,119 @@
     </w:lvl>
   </w:abstractNum>
   <w:abstractNum w:abstractNumId="2">
+    <w:nsid w:val="2AA65827"/>
+    <w:multiLevelType w:val="hybridMultilevel"/>
+    <w:tmpl w:val="289090BE"/>
+    <w:lvl w:ilvl="0" w:tplc="04090001">
+      <w:start w:val="1"/>
+      <w:numFmt w:val="bullet"/>
+      <w:lvlText w:val=""/>
+      <w:lvlJc w:val="left"/>
+      <w:pPr>
+        <w:ind w:left="720" w:hanging="360"/>
+      </w:pPr>
+      <w:rPr>
+        <w:rFonts w:ascii="Symbol" w:hAnsi="Symbol" w:hint="default"/>
+      </w:rPr>
+    </w:lvl>
+    <w:lvl w:ilvl="1" w:tplc="04090003" w:tentative="1">
+      <w:start w:val="1"/>
+      <w:numFmt w:val="bullet"/>
+      <w:lvlText w:val="o"/>
+      <w:lvlJc w:val="left"/>
+      <w:pPr>
+        <w:ind w:left="1440" w:hanging="360"/>
+      </w:pPr>
+      <w:rPr>
+        <w:rFonts w:ascii="Courier New" w:hAnsi="Courier New" w:cs="Courier New" w:hint="default"/>
+      </w:rPr>
+    </w:lvl>
+    <w:lvl w:ilvl="2" w:tplc="04090005" w:tentative="1">
+      <w:start w:val="1"/>
+      <w:numFmt w:val="bullet"/>
+      <w:lvlText w:val=""/>
+      <w:lvlJc w:val="left"/>
+      <w:pPr>
+        <w:ind w:left="2160" w:hanging="360"/>
+      </w:pPr>
+      <w:rPr>
+        <w:rFonts w:ascii="Wingdings" w:hAnsi="Wingdings" w:hint="default"/>
+      </w:rPr>
+    </w:lvl>
+    <w:lvl w:ilvl="3" w:tplc="04090001" w:tentative="1">
+      <w:start w:val="1"/>
+      <w:numFmt w:val="bullet"/>
+      <w:lvlText w:val=""/>
+      <w:lvlJc w:val="left"/>
+      <w:pPr>
+        <w:ind w:left="2880" w:hanging="360"/>
+      </w:pPr>
+      <w:rPr>
+        <w:rFonts w:ascii="Symbol" w:hAnsi="Symbol" w:hint="default"/>
+      </w:rPr>
+    </w:lvl>
+    <w:lvl w:ilvl="4" w:tplc="04090003" w:tentative="1">
+      <w:start w:val="1"/>
+      <w:numFmt w:val="bullet"/>
+      <w:lvlText w:val="o"/>
+      <w:lvlJc w:val="left"/>
+      <w:pPr>
+        <w:ind w:left="3600" w:hanging="360"/>
+      </w:pPr>
+      <w:rPr>
+        <w:rFonts w:ascii="Courier New" w:hAnsi="Courier New" w:cs="Courier New" w:hint="default"/>
+      </w:rPr>
+    </w:lvl>
+    <w:lvl w:ilvl="5" w:tplc="04090005" w:tentative="1">
+      <w:start w:val="1"/>
+      <w:numFmt w:val="bullet"/>
+      <w:lvlText w:val=""/>
+      <w:lvlJc w:val="left"/>
+      <w:pPr>
+        <w:ind w:left="4320" w:hanging="360"/>
+      </w:pPr>
+      <w:rPr>
+        <w:rFonts w:ascii="Wingdings" w:hAnsi="Wingdings" w:hint="default"/>
+      </w:rPr>
+    </w:lvl>
+    <w:lvl w:ilvl="6" w:tplc="04090001" w:tentative="1">
+      <w:start w:val="1"/>
+      <w:numFmt w:val="bullet"/>
+      <w:lvlText w:val=""/>
+      <w:lvlJc w:val="left"/>
+      <w:pPr>
+        <w:ind w:left="5040" w:hanging="360"/>
+      </w:pPr>
+      <w:rPr>
+        <w:rFonts w:ascii="Symbol" w:hAnsi="Symbol" w:hint="default"/>
+      </w:rPr>
+    </w:lvl>
+    <w:lvl w:ilvl="7" w:tplc="04090003" w:tentative="1">
+      <w:start w:val="1"/>
+      <w:numFmt w:val="bullet"/>
+      <w:lvlText w:val="o"/>
+      <w:lvlJc w:val="left"/>
+      <w:pPr>
+        <w:ind w:left="5760" w:hanging="360"/>
+      </w:pPr>
+      <w:rPr>
+        <w:rFonts w:ascii="Courier New" w:hAnsi="Courier New" w:cs="Courier New" w:hint="default"/>
+      </w:rPr>
+    </w:lvl>
+    <w:lvl w:ilvl="8" w:tplc="04090005" w:tentative="1">
+      <w:start w:val="1"/>
+      <w:numFmt w:val="bullet"/>
+      <w:lvlText w:val=""/>
+      <w:lvlJc w:val="left"/>
+      <w:pPr>
+        <w:ind w:left="6480" w:hanging="360"/>
+      </w:pPr>
+      <w:rPr>
+        <w:rFonts w:ascii="Wingdings" w:hAnsi="Wingdings" w:hint="default"/>
+      </w:rPr>
+    </w:lvl>
+  </w:abstractNum>
+  <w:abstractNum w:abstractNumId="3">
     <w:nsid w:val="52E26623"/>
     <w:multiLevelType w:val="hybridMultilevel"/>
     <w:tmpl w:val="35BA8A70"/>
@@ -1774,7 +1946,7 @@
         <w:rFonts w:ascii="Symbol" w:hAnsi="Symbol" w:hint="default"/>
       </w:rPr>
     </w:lvl>
-    <w:lvl w:ilvl="1" w:tplc="04090003" w:tentative="1">
+    <w:lvl w:ilvl="1" w:tplc="04090003">
       <w:start w:val="1"/>
       <w:numFmt w:val="bullet"/>
       <w:lvlText w:val="o"/>
@@ -1871,7 +2043,7 @@
       </w:rPr>
     </w:lvl>
   </w:abstractNum>
-  <w:abstractNum w:abstractNumId="3">
+  <w:abstractNum w:abstractNumId="4">
     <w:nsid w:val="70BB07AB"/>
     <w:multiLevelType w:val="hybridMultilevel"/>
     <w:tmpl w:val="5C62B0D0"/>
@@ -1984,7 +2156,7 @@
       </w:rPr>
     </w:lvl>
   </w:abstractNum>
-  <w:abstractNum w:abstractNumId="4">
+  <w:abstractNum w:abstractNumId="5">
     <w:nsid w:val="74E55304"/>
     <w:multiLevelType w:val="hybridMultilevel"/>
     <w:tmpl w:val="32C62242"/>
@@ -2098,19 +2270,22 @@
     </w:lvl>
   </w:abstractNum>
   <w:num w:numId="1">
+    <w:abstractNumId w:val="4"/>
+  </w:num>
+  <w:num w:numId="2">
     <w:abstractNumId w:val="3"/>
   </w:num>
-  <w:num w:numId="2">
-    <w:abstractNumId w:val="2"/>
-  </w:num>
   <w:num w:numId="3">
-    <w:abstractNumId w:val="4"/>
+    <w:abstractNumId w:val="5"/>
   </w:num>
   <w:num w:numId="4">
     <w:abstractNumId w:val="0"/>
   </w:num>
   <w:num w:numId="5">
     <w:abstractNumId w:val="1"/>
+  </w:num>
+  <w:num w:numId="6">
+    <w:abstractNumId w:val="2"/>
   </w:num>
 </w:numbering>
 </file>
@@ -2298,6 +2473,30 @@
       <w:szCs w:val="28"/>
     </w:rPr>
   </w:style>
+  <w:style w:type="paragraph" w:styleId="Heading2">
+    <w:name w:val="heading 2"/>
+    <w:basedOn w:val="Normal"/>
+    <w:next w:val="Normal"/>
+    <w:link w:val="Heading2Char"/>
+    <w:uiPriority w:val="9"/>
+    <w:unhideWhenUsed/>
+    <w:qFormat/>
+    <w:rsid w:val="002C55C8"/>
+    <w:pPr>
+      <w:keepNext/>
+      <w:keepLines/>
+      <w:spacing w:before="200" w:after="0"/>
+      <w:outlineLvl w:val="1"/>
+    </w:pPr>
+    <w:rPr>
+      <w:rFonts w:asciiTheme="majorHAnsi" w:eastAsiaTheme="majorEastAsia" w:hAnsiTheme="majorHAnsi" w:cstheme="majorBidi"/>
+      <w:b/>
+      <w:bCs/>
+      <w:color w:val="4F81BD" w:themeColor="accent1"/>
+      <w:sz w:val="26"/>
+      <w:szCs w:val="26"/>
+    </w:rPr>
+  </w:style>
   <w:style w:type="character" w:default="1" w:styleId="DefaultParagraphFont">
     <w:name w:val="Default Paragraph Font"/>
     <w:uiPriority w:val="1"/>
@@ -2389,6 +2588,21 @@
       <w:ind w:left="720"/>
       <w:contextualSpacing/>
     </w:pPr>
+  </w:style>
+  <w:style w:type="character" w:customStyle="1" w:styleId="Heading2Char">
+    <w:name w:val="Heading 2 Char"/>
+    <w:basedOn w:val="DefaultParagraphFont"/>
+    <w:link w:val="Heading2"/>
+    <w:uiPriority w:val="9"/>
+    <w:rsid w:val="002C55C8"/>
+    <w:rPr>
+      <w:rFonts w:asciiTheme="majorHAnsi" w:eastAsiaTheme="majorEastAsia" w:hAnsiTheme="majorHAnsi" w:cstheme="majorBidi"/>
+      <w:b/>
+      <w:bCs/>
+      <w:color w:val="4F81BD" w:themeColor="accent1"/>
+      <w:sz w:val="26"/>
+      <w:szCs w:val="26"/>
+    </w:rPr>
   </w:style>
 </w:styles>
 </file>
@@ -2576,6 +2790,30 @@
       <w:szCs w:val="28"/>
     </w:rPr>
   </w:style>
+  <w:style w:type="paragraph" w:styleId="Heading2">
+    <w:name w:val="heading 2"/>
+    <w:basedOn w:val="Normal"/>
+    <w:next w:val="Normal"/>
+    <w:link w:val="Heading2Char"/>
+    <w:uiPriority w:val="9"/>
+    <w:unhideWhenUsed/>
+    <w:qFormat/>
+    <w:rsid w:val="002C55C8"/>
+    <w:pPr>
+      <w:keepNext/>
+      <w:keepLines/>
+      <w:spacing w:before="200" w:after="0"/>
+      <w:outlineLvl w:val="1"/>
+    </w:pPr>
+    <w:rPr>
+      <w:rFonts w:asciiTheme="majorHAnsi" w:eastAsiaTheme="majorEastAsia" w:hAnsiTheme="majorHAnsi" w:cstheme="majorBidi"/>
+      <w:b/>
+      <w:bCs/>
+      <w:color w:val="4F81BD" w:themeColor="accent1"/>
+      <w:sz w:val="26"/>
+      <w:szCs w:val="26"/>
+    </w:rPr>
+  </w:style>
   <w:style w:type="character" w:default="1" w:styleId="DefaultParagraphFont">
     <w:name w:val="Default Paragraph Font"/>
     <w:uiPriority w:val="1"/>
@@ -2667,6 +2905,21 @@
       <w:ind w:left="720"/>
       <w:contextualSpacing/>
     </w:pPr>
+  </w:style>
+  <w:style w:type="character" w:customStyle="1" w:styleId="Heading2Char">
+    <w:name w:val="Heading 2 Char"/>
+    <w:basedOn w:val="DefaultParagraphFont"/>
+    <w:link w:val="Heading2"/>
+    <w:uiPriority w:val="9"/>
+    <w:rsid w:val="002C55C8"/>
+    <w:rPr>
+      <w:rFonts w:asciiTheme="majorHAnsi" w:eastAsiaTheme="majorEastAsia" w:hAnsiTheme="majorHAnsi" w:cstheme="majorBidi"/>
+      <w:b/>
+      <w:bCs/>
+      <w:color w:val="4F81BD" w:themeColor="accent1"/>
+      <w:sz w:val="26"/>
+      <w:szCs w:val="26"/>
+    </w:rPr>
   </w:style>
 </w:styles>
 </file>

</xml_diff>

<commit_message>
added my portion to sprint report
</commit_message>
<xml_diff>
--- a/srDesign_SprintReport2.docx
+++ b/srDesign_SprintReport2.docx
@@ -23,15 +23,7 @@
         <w:jc w:val="right"/>
       </w:pPr>
       <w:r>
-        <w:t xml:space="preserve">Members: Marshall Gaucher, Kevin </w:t>
-      </w:r>
-      <w:proofErr w:type="spellStart"/>
-      <w:r>
-        <w:t>Worner</w:t>
-      </w:r>
-      <w:proofErr w:type="spellEnd"/>
-      <w:r>
-        <w:t>, David Jarman</w:t>
+        <w:t>Members: Marshall Gaucher, Kevin Worner, David Jarman</w:t>
       </w:r>
     </w:p>
     <w:p>
@@ -1307,13 +1299,8 @@
         </w:numPr>
       </w:pPr>
       <w:r>
-        <w:t xml:space="preserve">Server – Kevin </w:t>
-      </w:r>
-      <w:proofErr w:type="spellStart"/>
-      <w:r>
-        <w:t>Worner</w:t>
-      </w:r>
-      <w:proofErr w:type="spellEnd"/>
+        <w:t>Server – Kevin Worner</w:t>
+      </w:r>
     </w:p>
     <w:p>
       <w:pPr>
@@ -1408,11 +1395,78 @@
       <w:r>
         <w:t>Ultimately reduces the current load on the STB since resources are requested instead of stored locally</w:t>
       </w:r>
+    </w:p>
+    <w:p>
+      <w:pPr>
+        <w:pStyle w:val="Heading2"/>
+      </w:pPr>
+      <w:proofErr w:type="spellStart"/>
+      <w:r>
+        <w:t>GameServer</w:t>
+      </w:r>
+      <w:proofErr w:type="spellEnd"/>
+      <w:r>
+        <w:t xml:space="preserve"> Features</w:t>
+      </w:r>
       <w:bookmarkStart w:id="0" w:name="_GoBack"/>
       <w:bookmarkEnd w:id="0"/>
     </w:p>
     <w:p>
       <w:pPr>
+        <w:pStyle w:val="ListParagraph"/>
+        <w:numPr>
+          <w:ilvl w:val="0"/>
+          <w:numId w:val="7"/>
+        </w:numPr>
+      </w:pPr>
+      <w:r>
+        <w:t>Created a TCP communications wrapper. At the moment, it merely echo’s back what it received.</w:t>
+      </w:r>
+    </w:p>
+    <w:p>
+      <w:pPr>
+        <w:pStyle w:val="ListParagraph"/>
+        <w:numPr>
+          <w:ilvl w:val="0"/>
+          <w:numId w:val="7"/>
+        </w:numPr>
+      </w:pPr>
+      <w:r>
+        <w:t>Halfway through translating network messages from paper design to code.</w:t>
+      </w:r>
+    </w:p>
+    <w:p>
+      <w:pPr>
+        <w:pStyle w:val="ListParagraph"/>
+        <w:numPr>
+          <w:ilvl w:val="0"/>
+          <w:numId w:val="7"/>
+        </w:numPr>
+      </w:pPr>
+      <w:r>
+        <w:t>Created a very</w:t>
+      </w:r>
+      <w:r>
+        <w:t xml:space="preserve"> simple</w:t>
+      </w:r>
+      <w:r>
+        <w:t xml:space="preserve"> prototype of server UI.</w:t>
+      </w:r>
+    </w:p>
+    <w:p>
+      <w:pPr>
+        <w:pStyle w:val="ListParagraph"/>
+        <w:numPr>
+          <w:ilvl w:val="0"/>
+          <w:numId w:val="7"/>
+        </w:numPr>
+      </w:pPr>
+      <w:r>
+        <w:t>All code currently in the server is covered with a test.</w:t>
+      </w:r>
+    </w:p>
+    <w:p>
+      <w:pPr>
         <w:pStyle w:val="Heading1"/>
       </w:pPr>
       <w:r>
@@ -1575,6 +1629,24 @@
       </w:pPr>
       <w:r>
         <w:t>Server</w:t>
+      </w:r>
+    </w:p>
+    <w:p>
+      <w:pPr>
+        <w:pStyle w:val="ListParagraph"/>
+        <w:numPr>
+          <w:ilvl w:val="1"/>
+          <w:numId w:val="5"/>
+        </w:numPr>
+      </w:pPr>
+      <w:r>
+        <w:t xml:space="preserve">Implemented UDP communications. </w:t>
+      </w:r>
+      <w:r>
+        <w:t>D</w:t>
+      </w:r>
+      <w:r>
+        <w:t xml:space="preserve">iscarded after clarification of network structure. </w:t>
       </w:r>
     </w:p>
     <w:p/>
@@ -2269,6 +2341,119 @@
       </w:rPr>
     </w:lvl>
   </w:abstractNum>
+  <w:abstractNum w:abstractNumId="6">
+    <w:nsid w:val="7828691B"/>
+    <w:multiLevelType w:val="hybridMultilevel"/>
+    <w:tmpl w:val="F85EEBC8"/>
+    <w:lvl w:ilvl="0" w:tplc="04090001">
+      <w:start w:val="1"/>
+      <w:numFmt w:val="bullet"/>
+      <w:lvlText w:val=""/>
+      <w:lvlJc w:val="left"/>
+      <w:pPr>
+        <w:ind w:left="720" w:hanging="360"/>
+      </w:pPr>
+      <w:rPr>
+        <w:rFonts w:ascii="Symbol" w:hAnsi="Symbol" w:hint="default"/>
+      </w:rPr>
+    </w:lvl>
+    <w:lvl w:ilvl="1" w:tplc="04090003" w:tentative="1">
+      <w:start w:val="1"/>
+      <w:numFmt w:val="bullet"/>
+      <w:lvlText w:val="o"/>
+      <w:lvlJc w:val="left"/>
+      <w:pPr>
+        <w:ind w:left="1440" w:hanging="360"/>
+      </w:pPr>
+      <w:rPr>
+        <w:rFonts w:ascii="Courier New" w:hAnsi="Courier New" w:cs="Courier New" w:hint="default"/>
+      </w:rPr>
+    </w:lvl>
+    <w:lvl w:ilvl="2" w:tplc="04090005" w:tentative="1">
+      <w:start w:val="1"/>
+      <w:numFmt w:val="bullet"/>
+      <w:lvlText w:val=""/>
+      <w:lvlJc w:val="left"/>
+      <w:pPr>
+        <w:ind w:left="2160" w:hanging="360"/>
+      </w:pPr>
+      <w:rPr>
+        <w:rFonts w:ascii="Wingdings" w:hAnsi="Wingdings" w:hint="default"/>
+      </w:rPr>
+    </w:lvl>
+    <w:lvl w:ilvl="3" w:tplc="04090001" w:tentative="1">
+      <w:start w:val="1"/>
+      <w:numFmt w:val="bullet"/>
+      <w:lvlText w:val=""/>
+      <w:lvlJc w:val="left"/>
+      <w:pPr>
+        <w:ind w:left="2880" w:hanging="360"/>
+      </w:pPr>
+      <w:rPr>
+        <w:rFonts w:ascii="Symbol" w:hAnsi="Symbol" w:hint="default"/>
+      </w:rPr>
+    </w:lvl>
+    <w:lvl w:ilvl="4" w:tplc="04090003" w:tentative="1">
+      <w:start w:val="1"/>
+      <w:numFmt w:val="bullet"/>
+      <w:lvlText w:val="o"/>
+      <w:lvlJc w:val="left"/>
+      <w:pPr>
+        <w:ind w:left="3600" w:hanging="360"/>
+      </w:pPr>
+      <w:rPr>
+        <w:rFonts w:ascii="Courier New" w:hAnsi="Courier New" w:cs="Courier New" w:hint="default"/>
+      </w:rPr>
+    </w:lvl>
+    <w:lvl w:ilvl="5" w:tplc="04090005" w:tentative="1">
+      <w:start w:val="1"/>
+      <w:numFmt w:val="bullet"/>
+      <w:lvlText w:val=""/>
+      <w:lvlJc w:val="left"/>
+      <w:pPr>
+        <w:ind w:left="4320" w:hanging="360"/>
+      </w:pPr>
+      <w:rPr>
+        <w:rFonts w:ascii="Wingdings" w:hAnsi="Wingdings" w:hint="default"/>
+      </w:rPr>
+    </w:lvl>
+    <w:lvl w:ilvl="6" w:tplc="04090001" w:tentative="1">
+      <w:start w:val="1"/>
+      <w:numFmt w:val="bullet"/>
+      <w:lvlText w:val=""/>
+      <w:lvlJc w:val="left"/>
+      <w:pPr>
+        <w:ind w:left="5040" w:hanging="360"/>
+      </w:pPr>
+      <w:rPr>
+        <w:rFonts w:ascii="Symbol" w:hAnsi="Symbol" w:hint="default"/>
+      </w:rPr>
+    </w:lvl>
+    <w:lvl w:ilvl="7" w:tplc="04090003" w:tentative="1">
+      <w:start w:val="1"/>
+      <w:numFmt w:val="bullet"/>
+      <w:lvlText w:val="o"/>
+      <w:lvlJc w:val="left"/>
+      <w:pPr>
+        <w:ind w:left="5760" w:hanging="360"/>
+      </w:pPr>
+      <w:rPr>
+        <w:rFonts w:ascii="Courier New" w:hAnsi="Courier New" w:cs="Courier New" w:hint="default"/>
+      </w:rPr>
+    </w:lvl>
+    <w:lvl w:ilvl="8" w:tplc="04090005" w:tentative="1">
+      <w:start w:val="1"/>
+      <w:numFmt w:val="bullet"/>
+      <w:lvlText w:val=""/>
+      <w:lvlJc w:val="left"/>
+      <w:pPr>
+        <w:ind w:left="6480" w:hanging="360"/>
+      </w:pPr>
+      <w:rPr>
+        <w:rFonts w:ascii="Wingdings" w:hAnsi="Wingdings" w:hint="default"/>
+      </w:rPr>
+    </w:lvl>
+  </w:abstractNum>
   <w:num w:numId="1">
     <w:abstractNumId w:val="4"/>
   </w:num>
@@ -2286,6 +2471,9 @@
   </w:num>
   <w:num w:numId="6">
     <w:abstractNumId w:val="2"/>
+  </w:num>
+  <w:num w:numId="7">
+    <w:abstractNumId w:val="6"/>
   </w:num>
 </w:numbering>
 </file>

</xml_diff>

<commit_message>
Added ethics and my changes to sprint report 2
</commit_message>
<xml_diff>
--- a/srDesign_SprintReport2.docx
+++ b/srDesign_SprintReport2.docx
@@ -149,25 +149,7 @@
           <w:szCs w:val="27"/>
         </w:rPr>
         <w:lastRenderedPageBreak/>
-        <w:t xml:space="preserve">Reports will describe the backlog and </w:t>
-      </w:r>
-      <w:proofErr w:type="spellStart"/>
-      <w:r>
-        <w:rPr>
-          <w:color w:val="000000"/>
-          <w:sz w:val="27"/>
-          <w:szCs w:val="27"/>
-        </w:rPr>
-        <w:t>burndown</w:t>
-      </w:r>
-      <w:proofErr w:type="spellEnd"/>
-      <w:r>
-        <w:rPr>
-          <w:color w:val="000000"/>
-          <w:sz w:val="27"/>
-          <w:szCs w:val="27"/>
-        </w:rPr>
-        <w:t>.  It should describe the prototype and its features.    You should include the activities (since the last report) such as meetings, client interactions, research, code experiments, etc.    Be sure to describe which team member did what activity.  </w:t>
+        <w:t>Reports will describe the backlog and burndown.  It should describe the prototype and its features.    You should include the activities (since the last report) such as meetings, client interactions, research, code experiments, etc.    Be sure to describe which team member did what activity.  </w:t>
       </w:r>
     </w:p>
     <w:p>
@@ -288,49 +270,8 @@
           <w:rFonts w:ascii="Arial" w:hAnsi="Arial" w:cs="Arial"/>
           <w:color w:val="444444"/>
         </w:rPr>
-        <w:t xml:space="preserve">Server: </w:t>
-      </w:r>
-      <w:proofErr w:type="spellStart"/>
-      <w:r>
-        <w:rPr>
-          <w:rFonts w:ascii="Arial" w:hAnsi="Arial" w:cs="Arial"/>
-          <w:color w:val="444444"/>
-        </w:rPr>
-        <w:t>cmd</w:t>
-      </w:r>
-      <w:proofErr w:type="spellEnd"/>
-      <w:r>
-        <w:rPr>
-          <w:rFonts w:ascii="Arial" w:hAnsi="Arial" w:cs="Arial"/>
-          <w:color w:val="444444"/>
-        </w:rPr>
-        <w:t xml:space="preserve"> message - look at </w:t>
-      </w:r>
-      <w:proofErr w:type="spellStart"/>
-      <w:r>
-        <w:rPr>
-          <w:rFonts w:ascii="Arial" w:hAnsi="Arial" w:cs="Arial"/>
-          <w:color w:val="444444"/>
-        </w:rPr>
-        <w:t>jordan's</w:t>
-      </w:r>
-      <w:proofErr w:type="spellEnd"/>
-      <w:r>
-        <w:rPr>
-          <w:rFonts w:ascii="Arial" w:hAnsi="Arial" w:cs="Arial"/>
-          <w:color w:val="444444"/>
-        </w:rPr>
-        <w:t xml:space="preserve"> </w:t>
-      </w:r>
-      <w:proofErr w:type="spellStart"/>
-      <w:r>
-        <w:rPr>
-          <w:rFonts w:ascii="Arial" w:hAnsi="Arial" w:cs="Arial"/>
-          <w:color w:val="444444"/>
-        </w:rPr>
-        <w:t>serializer</w:t>
-      </w:r>
-      <w:proofErr w:type="spellEnd"/>
+        <w:t>Server: cmd message - look at jordan's serializer</w:t>
+      </w:r>
     </w:p>
     <w:p>
       <w:pPr>
@@ -439,23 +380,7 @@
           <w:rFonts w:ascii="Arial" w:hAnsi="Arial" w:cs="Arial"/>
           <w:color w:val="444444"/>
         </w:rPr>
-        <w:t xml:space="preserve">Server: TCP: connections to </w:t>
-      </w:r>
-      <w:proofErr w:type="spellStart"/>
-      <w:r>
-        <w:rPr>
-          <w:rFonts w:ascii="Arial" w:hAnsi="Arial" w:cs="Arial"/>
-          <w:color w:val="444444"/>
-        </w:rPr>
-        <w:t>APMax</w:t>
-      </w:r>
-      <w:proofErr w:type="spellEnd"/>
-      <w:r>
-        <w:rPr>
-          <w:rFonts w:ascii="Arial" w:hAnsi="Arial" w:cs="Arial"/>
-          <w:color w:val="444444"/>
-        </w:rPr>
-        <w:t>, - receiving</w:t>
+        <w:t>Server: TCP: connections to APMax, - receiving</w:t>
       </w:r>
       <w:r>
         <w:rPr>
@@ -502,21 +427,12 @@
           <w:color w:val="444444"/>
         </w:rPr>
       </w:pPr>
-      <w:proofErr w:type="spellStart"/>
-      <w:r>
-        <w:rPr>
-          <w:rFonts w:ascii="Arial" w:hAnsi="Arial" w:cs="Arial"/>
-          <w:color w:val="444444"/>
-        </w:rPr>
-        <w:t>vAPMax</w:t>
-      </w:r>
-      <w:proofErr w:type="spellEnd"/>
-      <w:r>
-        <w:rPr>
-          <w:rFonts w:ascii="Arial" w:hAnsi="Arial" w:cs="Arial"/>
-          <w:color w:val="444444"/>
-        </w:rPr>
-        <w:t>: Unit Testing</w:t>
+      <w:r>
+        <w:rPr>
+          <w:rFonts w:ascii="Arial" w:hAnsi="Arial" w:cs="Arial"/>
+          <w:color w:val="444444"/>
+        </w:rPr>
+        <w:t>vAPMax: Unit Testing</w:t>
       </w:r>
     </w:p>
     <w:p>
@@ -535,31 +451,13 @@
           <w:color w:val="444444"/>
         </w:rPr>
       </w:pPr>
-      <w:proofErr w:type="spellStart"/>
-      <w:r>
-        <w:rPr>
-          <w:rFonts w:ascii="Arial" w:hAnsi="Arial" w:cs="Arial"/>
-          <w:color w:val="444444"/>
-        </w:rPr>
-        <w:t>vAPMax</w:t>
-      </w:r>
-      <w:proofErr w:type="spellEnd"/>
-      <w:r>
-        <w:rPr>
-          <w:rFonts w:ascii="Arial" w:hAnsi="Arial" w:cs="Arial"/>
-          <w:color w:val="444444"/>
-        </w:rPr>
-        <w:t>: Blocking/</w:t>
-      </w:r>
-      <w:proofErr w:type="spellStart"/>
-      <w:r>
-        <w:rPr>
-          <w:rFonts w:ascii="Arial" w:hAnsi="Arial" w:cs="Arial"/>
-          <w:color w:val="444444"/>
-        </w:rPr>
-        <w:t>Deblocking</w:t>
-      </w:r>
-      <w:proofErr w:type="spellEnd"/>
+      <w:r>
+        <w:rPr>
+          <w:rFonts w:ascii="Arial" w:hAnsi="Arial" w:cs="Arial"/>
+          <w:color w:val="444444"/>
+        </w:rPr>
+        <w:t>vAPMax: Blocking/Deblocking</w:t>
+      </w:r>
     </w:p>
     <w:p>
       <w:pPr>
@@ -577,21 +475,12 @@
           <w:color w:val="444444"/>
         </w:rPr>
       </w:pPr>
-      <w:proofErr w:type="spellStart"/>
-      <w:r>
-        <w:rPr>
-          <w:rFonts w:ascii="Arial" w:hAnsi="Arial" w:cs="Arial"/>
-          <w:color w:val="444444"/>
-        </w:rPr>
-        <w:t>vAPMax</w:t>
-      </w:r>
-      <w:proofErr w:type="spellEnd"/>
-      <w:r>
-        <w:rPr>
-          <w:rFonts w:ascii="Arial" w:hAnsi="Arial" w:cs="Arial"/>
-          <w:color w:val="444444"/>
-        </w:rPr>
-        <w:t xml:space="preserve"> Encryption/Decryption using AES</w:t>
+      <w:r>
+        <w:rPr>
+          <w:rFonts w:ascii="Arial" w:hAnsi="Arial" w:cs="Arial"/>
+          <w:color w:val="444444"/>
+        </w:rPr>
+        <w:t>vAPMax Encryption/Decryption using AES</w:t>
       </w:r>
     </w:p>
     <w:p>
@@ -610,23 +499,12 @@
           <w:color w:val="444444"/>
         </w:rPr>
       </w:pPr>
-      <w:proofErr w:type="spellStart"/>
-      <w:proofErr w:type="gramStart"/>
-      <w:r>
-        <w:rPr>
-          <w:rFonts w:ascii="Arial" w:hAnsi="Arial" w:cs="Arial"/>
-          <w:color w:val="444444"/>
-        </w:rPr>
-        <w:t>vAPMax</w:t>
-      </w:r>
-      <w:proofErr w:type="spellEnd"/>
-      <w:proofErr w:type="gramEnd"/>
-      <w:r>
-        <w:rPr>
-          <w:rFonts w:ascii="Arial" w:hAnsi="Arial" w:cs="Arial"/>
-          <w:color w:val="444444"/>
-        </w:rPr>
-        <w:t>: Integrate Logger into project and provide</w:t>
+      <w:r>
+        <w:rPr>
+          <w:rFonts w:ascii="Arial" w:hAnsi="Arial" w:cs="Arial"/>
+          <w:color w:val="444444"/>
+        </w:rPr>
+        <w:t>vAPMax: Integrate Logger into project and provide</w:t>
       </w:r>
       <w:r>
         <w:rPr>
@@ -664,17 +542,8 @@
           <w:rFonts w:ascii="Arial" w:hAnsi="Arial" w:cs="Arial"/>
           <w:color w:val="444444"/>
         </w:rPr>
-        <w:t xml:space="preserve">Prototype: </w:t>
-      </w:r>
-      <w:proofErr w:type="spellStart"/>
-      <w:r>
-        <w:rPr>
-          <w:rFonts w:ascii="Arial" w:hAnsi="Arial" w:cs="Arial"/>
-          <w:color w:val="444444"/>
-        </w:rPr>
-        <w:t>vAPMax</w:t>
-      </w:r>
-      <w:proofErr w:type="spellEnd"/>
+        <w:t>Prototype: vAPMax</w:t>
+      </w:r>
     </w:p>
     <w:p>
       <w:pPr>
@@ -692,21 +561,12 @@
           <w:color w:val="444444"/>
         </w:rPr>
       </w:pPr>
-      <w:proofErr w:type="spellStart"/>
-      <w:r>
-        <w:rPr>
-          <w:rFonts w:ascii="Arial" w:hAnsi="Arial" w:cs="Arial"/>
-          <w:color w:val="444444"/>
-        </w:rPr>
-        <w:t>vSTB</w:t>
-      </w:r>
-      <w:proofErr w:type="spellEnd"/>
-      <w:r>
-        <w:rPr>
-          <w:rFonts w:ascii="Arial" w:hAnsi="Arial" w:cs="Arial"/>
-          <w:color w:val="444444"/>
-        </w:rPr>
-        <w:t>: Unit Testing</w:t>
+      <w:r>
+        <w:rPr>
+          <w:rFonts w:ascii="Arial" w:hAnsi="Arial" w:cs="Arial"/>
+          <w:color w:val="444444"/>
+        </w:rPr>
+        <w:t>vSTB: Unit Testing</w:t>
       </w:r>
     </w:p>
     <w:p>
@@ -725,37 +585,12 @@
           <w:color w:val="444444"/>
         </w:rPr>
       </w:pPr>
-      <w:proofErr w:type="spellStart"/>
-      <w:r>
-        <w:rPr>
-          <w:rFonts w:ascii="Arial" w:hAnsi="Arial" w:cs="Arial"/>
-          <w:color w:val="444444"/>
-        </w:rPr>
-        <w:t>vAPMax</w:t>
-      </w:r>
-      <w:proofErr w:type="spellEnd"/>
-      <w:r>
-        <w:rPr>
-          <w:rFonts w:ascii="Arial" w:hAnsi="Arial" w:cs="Arial"/>
-          <w:color w:val="444444"/>
-        </w:rPr>
-        <w:t xml:space="preserve">: Research </w:t>
-      </w:r>
-      <w:proofErr w:type="spellStart"/>
-      <w:r>
-        <w:rPr>
-          <w:rFonts w:ascii="Arial" w:hAnsi="Arial" w:cs="Arial"/>
-          <w:color w:val="444444"/>
-        </w:rPr>
-        <w:t>CommandLink</w:t>
-      </w:r>
-      <w:proofErr w:type="spellEnd"/>
-      <w:r>
-        <w:rPr>
-          <w:rFonts w:ascii="Arial" w:hAnsi="Arial" w:cs="Arial"/>
-          <w:color w:val="444444"/>
-        </w:rPr>
-        <w:t xml:space="preserve"> header info, so</w:t>
+      <w:r>
+        <w:rPr>
+          <w:rFonts w:ascii="Arial" w:hAnsi="Arial" w:cs="Arial"/>
+          <w:color w:val="444444"/>
+        </w:rPr>
+        <w:t>vAPMax: Research CommandLink header info, so</w:t>
       </w:r>
       <w:r>
         <w:rPr>
@@ -926,21 +761,12 @@
           <w:color w:val="444444"/>
         </w:rPr>
       </w:pPr>
-      <w:proofErr w:type="spellStart"/>
-      <w:r>
-        <w:rPr>
-          <w:rFonts w:ascii="Arial" w:hAnsi="Arial" w:cs="Arial"/>
-          <w:color w:val="444444"/>
-        </w:rPr>
-        <w:t>vSTB</w:t>
-      </w:r>
-      <w:proofErr w:type="spellEnd"/>
-      <w:r>
-        <w:rPr>
-          <w:rFonts w:ascii="Arial" w:hAnsi="Arial" w:cs="Arial"/>
-          <w:color w:val="444444"/>
-        </w:rPr>
-        <w:t>:</w:t>
+      <w:r>
+        <w:rPr>
+          <w:rFonts w:ascii="Arial" w:hAnsi="Arial" w:cs="Arial"/>
+          <w:color w:val="444444"/>
+        </w:rPr>
+        <w:t>vSTB:</w:t>
       </w:r>
       <w:r>
         <w:rPr>
@@ -973,38 +799,20 @@
           <w:color w:val="444444"/>
         </w:rPr>
       </w:pPr>
-      <w:proofErr w:type="spellStart"/>
-      <w:r>
-        <w:rPr>
-          <w:rFonts w:ascii="Arial" w:hAnsi="Arial" w:cs="Arial"/>
-          <w:color w:val="444444"/>
-        </w:rPr>
-        <w:t>vSTB</w:t>
-      </w:r>
-      <w:proofErr w:type="spellEnd"/>
-      <w:r>
-        <w:rPr>
-          <w:rFonts w:ascii="Arial" w:hAnsi="Arial" w:cs="Arial"/>
-          <w:color w:val="444444"/>
-        </w:rPr>
-        <w:t xml:space="preserve">: </w:t>
-      </w:r>
-      <w:r>
-        <w:rPr>
-          <w:rFonts w:ascii="Arial" w:hAnsi="Arial" w:cs="Arial"/>
-          <w:color w:val="444444"/>
-        </w:rPr>
-        <w:t xml:space="preserve">Prove out and implement </w:t>
-      </w:r>
-      <w:proofErr w:type="spellStart"/>
-      <w:r>
-        <w:rPr>
-          <w:rFonts w:ascii="Arial" w:hAnsi="Arial" w:cs="Arial"/>
-          <w:color w:val="444444"/>
-        </w:rPr>
-        <w:t>QUiLoader</w:t>
-      </w:r>
-      <w:proofErr w:type="spellEnd"/>
+      <w:r>
+        <w:rPr>
+          <w:rFonts w:ascii="Arial" w:hAnsi="Arial" w:cs="Arial"/>
+          <w:color w:val="444444"/>
+        </w:rPr>
+        <w:t xml:space="preserve">vSTB: </w:t>
+      </w:r>
+      <w:r>
+        <w:rPr>
+          <w:rFonts w:ascii="Arial" w:hAnsi="Arial" w:cs="Arial"/>
+          <w:color w:val="444444"/>
+        </w:rPr>
+        <w:t>Prove out and implement QUiLoader</w:t>
+      </w:r>
     </w:p>
     <w:p>
       <w:pPr>
@@ -1053,21 +861,12 @@
           <w:color w:val="444444"/>
         </w:rPr>
       </w:pPr>
-      <w:proofErr w:type="spellStart"/>
-      <w:r>
-        <w:rPr>
-          <w:rFonts w:ascii="Arial" w:hAnsi="Arial" w:cs="Arial"/>
-          <w:color w:val="444444"/>
-        </w:rPr>
-        <w:t>vSTB</w:t>
-      </w:r>
-      <w:proofErr w:type="spellEnd"/>
-      <w:r>
-        <w:rPr>
-          <w:rFonts w:ascii="Arial" w:hAnsi="Arial" w:cs="Arial"/>
-          <w:color w:val="444444"/>
-        </w:rPr>
-        <w:t xml:space="preserve">: Research </w:t>
+      <w:r>
+        <w:rPr>
+          <w:rFonts w:ascii="Arial" w:hAnsi="Arial" w:cs="Arial"/>
+          <w:color w:val="444444"/>
+        </w:rPr>
+        <w:t xml:space="preserve">vSTB: Research </w:t>
       </w:r>
       <w:r>
         <w:rPr>
@@ -1093,21 +892,12 @@
           <w:color w:val="444444"/>
         </w:rPr>
       </w:pPr>
-      <w:proofErr w:type="spellStart"/>
-      <w:r>
-        <w:rPr>
-          <w:rFonts w:ascii="Arial" w:hAnsi="Arial" w:cs="Arial"/>
-          <w:color w:val="444444"/>
-        </w:rPr>
-        <w:t>vSTB</w:t>
-      </w:r>
-      <w:proofErr w:type="spellEnd"/>
-      <w:r>
-        <w:rPr>
-          <w:rFonts w:ascii="Arial" w:hAnsi="Arial" w:cs="Arial"/>
-          <w:color w:val="444444"/>
-        </w:rPr>
-        <w:t>:</w:t>
+      <w:r>
+        <w:rPr>
+          <w:rFonts w:ascii="Arial" w:hAnsi="Arial" w:cs="Arial"/>
+          <w:color w:val="444444"/>
+        </w:rPr>
+        <w:t>vSTB:</w:t>
       </w:r>
       <w:r>
         <w:rPr>
@@ -1185,21 +975,12 @@
           <w:color w:val="444444"/>
         </w:rPr>
       </w:pPr>
-      <w:proofErr w:type="spellStart"/>
-      <w:r>
-        <w:rPr>
-          <w:rFonts w:ascii="Arial" w:hAnsi="Arial" w:cs="Arial"/>
-          <w:color w:val="444444"/>
-        </w:rPr>
-        <w:t>vSTB</w:t>
-      </w:r>
-      <w:proofErr w:type="spellEnd"/>
-      <w:r>
-        <w:rPr>
-          <w:rFonts w:ascii="Arial" w:hAnsi="Arial" w:cs="Arial"/>
-          <w:color w:val="444444"/>
-        </w:rPr>
-        <w:t xml:space="preserve">: </w:t>
+      <w:r>
+        <w:rPr>
+          <w:rFonts w:ascii="Arial" w:hAnsi="Arial" w:cs="Arial"/>
+          <w:color w:val="444444"/>
+        </w:rPr>
+        <w:t xml:space="preserve">vSTB: </w:t>
       </w:r>
       <w:r>
         <w:rPr>
@@ -1240,21 +1021,12 @@
           <w:numId w:val="1"/>
         </w:numPr>
       </w:pPr>
-      <w:proofErr w:type="spellStart"/>
-      <w:r>
-        <w:rPr>
-          <w:rFonts w:ascii="Arial" w:hAnsi="Arial" w:cs="Arial"/>
-          <w:color w:val="444444"/>
-        </w:rPr>
-        <w:t>vSTB</w:t>
-      </w:r>
-      <w:proofErr w:type="spellEnd"/>
-      <w:r>
-        <w:rPr>
-          <w:rFonts w:ascii="Arial" w:hAnsi="Arial" w:cs="Arial"/>
-          <w:color w:val="444444"/>
-        </w:rPr>
-        <w:t>: UDP command message</w:t>
+      <w:r>
+        <w:rPr>
+          <w:rFonts w:ascii="Arial" w:hAnsi="Arial" w:cs="Arial"/>
+          <w:color w:val="444444"/>
+        </w:rPr>
+        <w:t>vSTB: UDP command message</w:t>
       </w:r>
     </w:p>
     <w:p>
@@ -1265,21 +1037,12 @@
           <w:numId w:val="1"/>
         </w:numPr>
       </w:pPr>
-      <w:proofErr w:type="spellStart"/>
-      <w:r>
-        <w:rPr>
-          <w:rFonts w:ascii="Arial" w:hAnsi="Arial" w:cs="Arial"/>
-          <w:color w:val="444444"/>
-        </w:rPr>
-        <w:t>vSTB</w:t>
-      </w:r>
-      <w:proofErr w:type="spellEnd"/>
-      <w:r>
-        <w:rPr>
-          <w:rFonts w:ascii="Arial" w:hAnsi="Arial" w:cs="Arial"/>
-          <w:color w:val="444444"/>
-        </w:rPr>
-        <w:t>: TCP command message</w:t>
+      <w:r>
+        <w:rPr>
+          <w:rFonts w:ascii="Arial" w:hAnsi="Arial" w:cs="Arial"/>
+          <w:color w:val="444444"/>
+        </w:rPr>
+        <w:t>vSTB: TCP command message</w:t>
       </w:r>
     </w:p>
     <w:p>
@@ -1310,13 +1073,8 @@
           <w:numId w:val="2"/>
         </w:numPr>
       </w:pPr>
-      <w:proofErr w:type="spellStart"/>
-      <w:r>
-        <w:t>vAPMAX</w:t>
-      </w:r>
-      <w:proofErr w:type="spellEnd"/>
-      <w:r>
-        <w:t>- David Jarman</w:t>
+      <w:r>
+        <w:t>vAPMAX- David Jarman</w:t>
       </w:r>
     </w:p>
     <w:p>
@@ -1327,29 +1085,17 @@
           <w:numId w:val="2"/>
         </w:numPr>
       </w:pPr>
-      <w:proofErr w:type="spellStart"/>
-      <w:r>
-        <w:t>vSTB</w:t>
-      </w:r>
-      <w:proofErr w:type="spellEnd"/>
-      <w:r>
-        <w:t>- Marshall Gaucher</w:t>
+      <w:r>
+        <w:t>vSTB- Marshall Gaucher</w:t>
       </w:r>
     </w:p>
     <w:p>
       <w:pPr>
         <w:pStyle w:val="Heading2"/>
       </w:pPr>
-      <w:proofErr w:type="spellStart"/>
-      <w:proofErr w:type="gramStart"/>
       <w:r>
         <w:lastRenderedPageBreak/>
-        <w:t>vSTB</w:t>
-      </w:r>
-      <w:proofErr w:type="spellEnd"/>
-      <w:proofErr w:type="gramEnd"/>
-      <w:r>
-        <w:t xml:space="preserve"> Features</w:t>
+        <w:t>vSTB Features</w:t>
       </w:r>
     </w:p>
     <w:p>
@@ -1361,15 +1107,7 @@
         </w:numPr>
       </w:pPr>
       <w:r>
-        <w:t xml:space="preserve">Communication Layer component allows the </w:t>
-      </w:r>
-      <w:proofErr w:type="spellStart"/>
-      <w:r>
-        <w:t>vSTB</w:t>
-      </w:r>
-      <w:proofErr w:type="spellEnd"/>
-      <w:r>
-        <w:t xml:space="preserve"> to send and receive UDP and TCP messages that are defined in the Command Message protocol.</w:t>
+        <w:t>Communication Layer component allows the vSTB to send and receive UDP and TCP messages that are defined in the Command Message protocol.</w:t>
       </w:r>
     </w:p>
     <w:p>
@@ -1400,73 +1138,115 @@
       <w:pPr>
         <w:pStyle w:val="Heading2"/>
       </w:pPr>
-      <w:proofErr w:type="spellStart"/>
-      <w:r>
-        <w:t>GameServer</w:t>
-      </w:r>
-      <w:proofErr w:type="spellEnd"/>
-      <w:r>
-        <w:t xml:space="preserve"> Features</w:t>
+      <w:r>
+        <w:t>GameServer Features</w:t>
+      </w:r>
+    </w:p>
+    <w:p>
+      <w:pPr>
+        <w:pStyle w:val="ListParagraph"/>
+        <w:numPr>
+          <w:ilvl w:val="0"/>
+          <w:numId w:val="7"/>
+        </w:numPr>
+      </w:pPr>
+      <w:r>
+        <w:t>Created a TCP communications wrapper. At the moment, it merely echo’s back what it received.</w:t>
+      </w:r>
+    </w:p>
+    <w:p>
+      <w:pPr>
+        <w:pStyle w:val="ListParagraph"/>
+        <w:numPr>
+          <w:ilvl w:val="0"/>
+          <w:numId w:val="7"/>
+        </w:numPr>
+      </w:pPr>
+      <w:r>
+        <w:t>Halfway through translating network messages from paper design to code.</w:t>
+      </w:r>
+    </w:p>
+    <w:p>
+      <w:pPr>
+        <w:pStyle w:val="ListParagraph"/>
+        <w:numPr>
+          <w:ilvl w:val="0"/>
+          <w:numId w:val="7"/>
+        </w:numPr>
+      </w:pPr>
+      <w:r>
+        <w:t>Created a very</w:t>
+      </w:r>
+      <w:r>
+        <w:t xml:space="preserve"> simple</w:t>
+      </w:r>
+      <w:r>
+        <w:t xml:space="preserve"> prototype of server UI.</w:t>
+      </w:r>
+    </w:p>
+    <w:p>
+      <w:pPr>
+        <w:pStyle w:val="ListParagraph"/>
+        <w:numPr>
+          <w:ilvl w:val="0"/>
+          <w:numId w:val="7"/>
+        </w:numPr>
+      </w:pPr>
+      <w:r>
+        <w:t>All code currently in the server is covered with a test.</w:t>
+      </w:r>
+    </w:p>
+    <w:p>
+      <w:pPr>
+        <w:pStyle w:val="Heading2"/>
+      </w:pPr>
+      <w:r>
+        <w:t>vAPMax Features</w:t>
+      </w:r>
+    </w:p>
+    <w:p>
+      <w:pPr>
+        <w:pStyle w:val="ListParagraph"/>
+        <w:numPr>
+          <w:ilvl w:val="0"/>
+          <w:numId w:val="8"/>
+        </w:numPr>
+      </w:pPr>
+      <w:r>
+        <w:t xml:space="preserve">Researched Reactive Extension (Rx) in order to handle TCP/UDP packet receiving/sending. </w:t>
+      </w:r>
+    </w:p>
+    <w:p>
+      <w:pPr>
+        <w:pStyle w:val="ListParagraph"/>
+        <w:numPr>
+          <w:ilvl w:val="0"/>
+          <w:numId w:val="8"/>
+        </w:numPr>
+      </w:pPr>
+      <w:r>
+        <w:t>Created a UDP and a TCP server using Rx and stubbed out basic handling of packets.</w:t>
+      </w:r>
+    </w:p>
+    <w:p>
+      <w:pPr>
+        <w:pStyle w:val="ListParagraph"/>
+        <w:numPr>
+          <w:ilvl w:val="0"/>
+          <w:numId w:val="8"/>
+        </w:numPr>
+      </w:pPr>
+      <w:r>
+        <w:t>Researched socket programming to become effective in handli</w:t>
+      </w:r>
+      <w:r>
+        <w:t>ng packet sending and receiving</w:t>
       </w:r>
       <w:bookmarkStart w:id="0" w:name="_GoBack"/>
       <w:bookmarkEnd w:id="0"/>
     </w:p>
     <w:p>
       <w:pPr>
-        <w:pStyle w:val="ListParagraph"/>
-        <w:numPr>
-          <w:ilvl w:val="0"/>
-          <w:numId w:val="7"/>
-        </w:numPr>
-      </w:pPr>
-      <w:r>
-        <w:t>Created a TCP communications wrapper. At the moment, it merely echo’s back what it received.</w:t>
-      </w:r>
-    </w:p>
-    <w:p>
-      <w:pPr>
-        <w:pStyle w:val="ListParagraph"/>
-        <w:numPr>
-          <w:ilvl w:val="0"/>
-          <w:numId w:val="7"/>
-        </w:numPr>
-      </w:pPr>
-      <w:r>
-        <w:t>Halfway through translating network messages from paper design to code.</w:t>
-      </w:r>
-    </w:p>
-    <w:p>
-      <w:pPr>
-        <w:pStyle w:val="ListParagraph"/>
-        <w:numPr>
-          <w:ilvl w:val="0"/>
-          <w:numId w:val="7"/>
-        </w:numPr>
-      </w:pPr>
-      <w:r>
-        <w:t>Created a very</w:t>
-      </w:r>
-      <w:r>
-        <w:t xml:space="preserve"> simple</w:t>
-      </w:r>
-      <w:r>
-        <w:t xml:space="preserve"> prototype of server UI.</w:t>
-      </w:r>
-    </w:p>
-    <w:p>
-      <w:pPr>
-        <w:pStyle w:val="ListParagraph"/>
-        <w:numPr>
-          <w:ilvl w:val="0"/>
-          <w:numId w:val="7"/>
-        </w:numPr>
-      </w:pPr>
-      <w:r>
-        <w:t>All code currently in the server is covered with a test.</w:t>
-      </w:r>
-    </w:p>
-    <w:p>
-      <w:pPr>
         <w:pStyle w:val="Heading1"/>
       </w:pPr>
       <w:r>
@@ -1482,7 +1262,10 @@
         </w:numPr>
       </w:pPr>
       <w:r>
-        <w:t>refined communication of existing network so we can understand how to implement it on our components</w:t>
+        <w:t>R</w:t>
+      </w:r>
+      <w:r>
+        <w:t>efined communication of existing network so we can understand how to implement it on our components</w:t>
       </w:r>
     </w:p>
     <w:p>
@@ -1494,7 +1277,10 @@
         </w:numPr>
       </w:pPr>
       <w:r>
-        <w:t>refined scope of each component</w:t>
+        <w:t>R</w:t>
+      </w:r>
+      <w:r>
+        <w:t>efined scope of each component</w:t>
       </w:r>
     </w:p>
     <w:p>
@@ -1506,7 +1292,10 @@
         </w:numPr>
       </w:pPr>
       <w:r>
-        <w:t>updated product backlog to give our client a vision and sense of progress</w:t>
+        <w:t>U</w:t>
+      </w:r>
+      <w:r>
+        <w:t>pdated product backlog to give our client a vision and sense of progress</w:t>
       </w:r>
     </w:p>
     <w:p>
@@ -1525,13 +1314,8 @@
           <w:numId w:val="4"/>
         </w:numPr>
       </w:pPr>
-      <w:proofErr w:type="spellStart"/>
-      <w:r>
-        <w:t>CommandLink</w:t>
-      </w:r>
-      <w:proofErr w:type="spellEnd"/>
-      <w:r>
-        <w:t xml:space="preserve"> Message</w:t>
+      <w:r>
+        <w:t>CommandLink Message</w:t>
       </w:r>
     </w:p>
     <w:p>
@@ -1543,13 +1327,8 @@
         </w:numPr>
       </w:pPr>
       <w:r>
-        <w:t xml:space="preserve">Reactive Extension for Server and </w:t>
-      </w:r>
-      <w:proofErr w:type="spellStart"/>
-      <w:r>
-        <w:t>vAPMAX</w:t>
-      </w:r>
-      <w:proofErr w:type="spellEnd"/>
+        <w:t>Reactive Extension for Server and vAPMAX</w:t>
+      </w:r>
     </w:p>
     <w:p>
       <w:pPr>
@@ -1579,11 +1358,9 @@
           <w:numId w:val="5"/>
         </w:numPr>
       </w:pPr>
-      <w:proofErr w:type="spellStart"/>
       <w:r>
         <w:t>vSTB</w:t>
       </w:r>
-      <w:proofErr w:type="spellEnd"/>
     </w:p>
     <w:p>
       <w:pPr>
@@ -1594,15 +1371,10 @@
         </w:numPr>
       </w:pPr>
       <w:r>
-        <w:t xml:space="preserve">implementing existing STB code using </w:t>
-      </w:r>
-      <w:proofErr w:type="spellStart"/>
-      <w:r>
-        <w:t>Qt</w:t>
-      </w:r>
-      <w:proofErr w:type="spellEnd"/>
-      <w:r>
-        <w:t xml:space="preserve"> libraries to make it platform independent</w:t>
+        <w:t>I</w:t>
+      </w:r>
+      <w:r>
+        <w:t>mplementing existing STB code using Qt libraries to make it platform independent</w:t>
       </w:r>
     </w:p>
     <w:p>
@@ -1613,11 +1385,21 @@
           <w:numId w:val="5"/>
         </w:numPr>
       </w:pPr>
-      <w:proofErr w:type="spellStart"/>
       <w:r>
         <w:t>vAPMAX</w:t>
       </w:r>
-      <w:proofErr w:type="spellEnd"/>
+    </w:p>
+    <w:p>
+      <w:pPr>
+        <w:pStyle w:val="ListParagraph"/>
+        <w:numPr>
+          <w:ilvl w:val="1"/>
+          <w:numId w:val="5"/>
+        </w:numPr>
+      </w:pPr>
+      <w:r>
+        <w:t>Implemented UDP and TCP communication using Reactive Extensions.</w:t>
+      </w:r>
     </w:p>
     <w:p>
       <w:pPr>
@@ -1890,6 +1672,119 @@
     </w:lvl>
   </w:abstractNum>
   <w:abstractNum w:abstractNumId="2">
+    <w:nsid w:val="24517F35"/>
+    <w:multiLevelType w:val="hybridMultilevel"/>
+    <w:tmpl w:val="DBB65BDC"/>
+    <w:lvl w:ilvl="0" w:tplc="04090001">
+      <w:start w:val="1"/>
+      <w:numFmt w:val="bullet"/>
+      <w:lvlText w:val=""/>
+      <w:lvlJc w:val="left"/>
+      <w:pPr>
+        <w:ind w:left="720" w:hanging="360"/>
+      </w:pPr>
+      <w:rPr>
+        <w:rFonts w:ascii="Symbol" w:hAnsi="Symbol" w:hint="default"/>
+      </w:rPr>
+    </w:lvl>
+    <w:lvl w:ilvl="1" w:tplc="04090003" w:tentative="1">
+      <w:start w:val="1"/>
+      <w:numFmt w:val="bullet"/>
+      <w:lvlText w:val="o"/>
+      <w:lvlJc w:val="left"/>
+      <w:pPr>
+        <w:ind w:left="1440" w:hanging="360"/>
+      </w:pPr>
+      <w:rPr>
+        <w:rFonts w:ascii="Courier New" w:hAnsi="Courier New" w:cs="Courier New" w:hint="default"/>
+      </w:rPr>
+    </w:lvl>
+    <w:lvl w:ilvl="2" w:tplc="04090005" w:tentative="1">
+      <w:start w:val="1"/>
+      <w:numFmt w:val="bullet"/>
+      <w:lvlText w:val=""/>
+      <w:lvlJc w:val="left"/>
+      <w:pPr>
+        <w:ind w:left="2160" w:hanging="360"/>
+      </w:pPr>
+      <w:rPr>
+        <w:rFonts w:ascii="Wingdings" w:hAnsi="Wingdings" w:hint="default"/>
+      </w:rPr>
+    </w:lvl>
+    <w:lvl w:ilvl="3" w:tplc="04090001" w:tentative="1">
+      <w:start w:val="1"/>
+      <w:numFmt w:val="bullet"/>
+      <w:lvlText w:val=""/>
+      <w:lvlJc w:val="left"/>
+      <w:pPr>
+        <w:ind w:left="2880" w:hanging="360"/>
+      </w:pPr>
+      <w:rPr>
+        <w:rFonts w:ascii="Symbol" w:hAnsi="Symbol" w:hint="default"/>
+      </w:rPr>
+    </w:lvl>
+    <w:lvl w:ilvl="4" w:tplc="04090003" w:tentative="1">
+      <w:start w:val="1"/>
+      <w:numFmt w:val="bullet"/>
+      <w:lvlText w:val="o"/>
+      <w:lvlJc w:val="left"/>
+      <w:pPr>
+        <w:ind w:left="3600" w:hanging="360"/>
+      </w:pPr>
+      <w:rPr>
+        <w:rFonts w:ascii="Courier New" w:hAnsi="Courier New" w:cs="Courier New" w:hint="default"/>
+      </w:rPr>
+    </w:lvl>
+    <w:lvl w:ilvl="5" w:tplc="04090005" w:tentative="1">
+      <w:start w:val="1"/>
+      <w:numFmt w:val="bullet"/>
+      <w:lvlText w:val=""/>
+      <w:lvlJc w:val="left"/>
+      <w:pPr>
+        <w:ind w:left="4320" w:hanging="360"/>
+      </w:pPr>
+      <w:rPr>
+        <w:rFonts w:ascii="Wingdings" w:hAnsi="Wingdings" w:hint="default"/>
+      </w:rPr>
+    </w:lvl>
+    <w:lvl w:ilvl="6" w:tplc="04090001" w:tentative="1">
+      <w:start w:val="1"/>
+      <w:numFmt w:val="bullet"/>
+      <w:lvlText w:val=""/>
+      <w:lvlJc w:val="left"/>
+      <w:pPr>
+        <w:ind w:left="5040" w:hanging="360"/>
+      </w:pPr>
+      <w:rPr>
+        <w:rFonts w:ascii="Symbol" w:hAnsi="Symbol" w:hint="default"/>
+      </w:rPr>
+    </w:lvl>
+    <w:lvl w:ilvl="7" w:tplc="04090003" w:tentative="1">
+      <w:start w:val="1"/>
+      <w:numFmt w:val="bullet"/>
+      <w:lvlText w:val="o"/>
+      <w:lvlJc w:val="left"/>
+      <w:pPr>
+        <w:ind w:left="5760" w:hanging="360"/>
+      </w:pPr>
+      <w:rPr>
+        <w:rFonts w:ascii="Courier New" w:hAnsi="Courier New" w:cs="Courier New" w:hint="default"/>
+      </w:rPr>
+    </w:lvl>
+    <w:lvl w:ilvl="8" w:tplc="04090005" w:tentative="1">
+      <w:start w:val="1"/>
+      <w:numFmt w:val="bullet"/>
+      <w:lvlText w:val=""/>
+      <w:lvlJc w:val="left"/>
+      <w:pPr>
+        <w:ind w:left="6480" w:hanging="360"/>
+      </w:pPr>
+      <w:rPr>
+        <w:rFonts w:ascii="Wingdings" w:hAnsi="Wingdings" w:hint="default"/>
+      </w:rPr>
+    </w:lvl>
+  </w:abstractNum>
+  <w:abstractNum w:abstractNumId="3">
     <w:nsid w:val="2AA65827"/>
     <w:multiLevelType w:val="hybridMultilevel"/>
     <w:tmpl w:val="289090BE"/>
@@ -2002,7 +1897,7 @@
       </w:rPr>
     </w:lvl>
   </w:abstractNum>
-  <w:abstractNum w:abstractNumId="3">
+  <w:abstractNum w:abstractNumId="4">
     <w:nsid w:val="52E26623"/>
     <w:multiLevelType w:val="hybridMultilevel"/>
     <w:tmpl w:val="35BA8A70"/>
@@ -2115,7 +2010,7 @@
       </w:rPr>
     </w:lvl>
   </w:abstractNum>
-  <w:abstractNum w:abstractNumId="4">
+  <w:abstractNum w:abstractNumId="5">
     <w:nsid w:val="70BB07AB"/>
     <w:multiLevelType w:val="hybridMultilevel"/>
     <w:tmpl w:val="5C62B0D0"/>
@@ -2228,7 +2123,7 @@
       </w:rPr>
     </w:lvl>
   </w:abstractNum>
-  <w:abstractNum w:abstractNumId="5">
+  <w:abstractNum w:abstractNumId="6">
     <w:nsid w:val="74E55304"/>
     <w:multiLevelType w:val="hybridMultilevel"/>
     <w:tmpl w:val="32C62242"/>
@@ -2341,7 +2236,7 @@
       </w:rPr>
     </w:lvl>
   </w:abstractNum>
-  <w:abstractNum w:abstractNumId="6">
+  <w:abstractNum w:abstractNumId="7">
     <w:nsid w:val="7828691B"/>
     <w:multiLevelType w:val="hybridMultilevel"/>
     <w:tmpl w:val="F85EEBC8"/>
@@ -2455,13 +2350,13 @@
     </w:lvl>
   </w:abstractNum>
   <w:num w:numId="1">
+    <w:abstractNumId w:val="5"/>
+  </w:num>
+  <w:num w:numId="2">
     <w:abstractNumId w:val="4"/>
   </w:num>
-  <w:num w:numId="2">
-    <w:abstractNumId w:val="3"/>
-  </w:num>
   <w:num w:numId="3">
-    <w:abstractNumId w:val="5"/>
+    <w:abstractNumId w:val="6"/>
   </w:num>
   <w:num w:numId="4">
     <w:abstractNumId w:val="0"/>
@@ -2470,10 +2365,13 @@
     <w:abstractNumId w:val="1"/>
   </w:num>
   <w:num w:numId="6">
-    <w:abstractNumId w:val="2"/>
+    <w:abstractNumId w:val="3"/>
   </w:num>
   <w:num w:numId="7">
-    <w:abstractNumId w:val="6"/>
+    <w:abstractNumId w:val="7"/>
+  </w:num>
+  <w:num w:numId="8">
+    <w:abstractNumId w:val="2"/>
   </w:num>
 </w:numbering>
 </file>

</xml_diff>